<commit_message>
Added soem photos and changes to week 1 portfolio
</commit_message>
<xml_diff>
--- a/Portfolio/COMP6841_Week_1_z5425064.docx
+++ b/Portfolio/COMP6841_Week_1_z5425064.docx
@@ -819,10 +819,6 @@
           <w:p/>
           <w:p/>
           <w:p/>
-          <w:p/>
-          <w:p/>
-          <w:p/>
-          <w:p/>
           <w:p>
             <w:pPr>
               <w:rPr>
@@ -849,7 +845,19 @@
           <w:rPr>
             <w:rStyle w:val="Hyperlink"/>
           </w:rPr>
-          <w:t>Physical Security</w:t>
+          <w:t xml:space="preserve">Physical </w:t>
+        </w:r>
+        <w:r>
+          <w:rPr>
+            <w:rStyle w:val="Hyperlink"/>
+          </w:rPr>
+          <w:t>S</w:t>
+        </w:r>
+        <w:r>
+          <w:rPr>
+            <w:rStyle w:val="Hyperlink"/>
+          </w:rPr>
+          <w:t>ecurity</w:t>
         </w:r>
       </w:hyperlink>
     </w:p>
@@ -1011,11 +1019,7 @@
             </w:r>
             <w:proofErr w:type="gramEnd"/>
             <w:r>
-              <w:t xml:space="preserve"> I learnt a lot of different methods of SQL injection. I found that the underlying weakness comes in the nuance of how the user code is added to the </w:t>
-            </w:r>
-            <w:r>
-              <w:lastRenderedPageBreak/>
-              <w:t xml:space="preserve">SQL command. If a direct string entry is added it gives the user the ability to change the overall command beyond the intention of an argument, this can be exploited to change the security logic of databases and grant access to adversaries. </w:t>
+              <w:t xml:space="preserve"> I learnt a lot of different methods of SQL injection. I found that the underlying weakness comes in the nuance of how the user code is added to the SQL command. If a direct string entry is added it gives the user the ability to change the overall command beyond the intention of an argument, this can be exploited to change the security logic of databases and grant access to adversaries. </w:t>
             </w:r>
           </w:p>
           <w:p/>
@@ -1024,6 +1028,7 @@
               <w:pStyle w:val="Heading2"/>
             </w:pPr>
             <w:r>
+              <w:lastRenderedPageBreak/>
               <w:t>SQLi 1</w:t>
             </w:r>
           </w:p>

</xml_diff>

<commit_message>
Bluetooth experiment write up completed
</commit_message>
<xml_diff>
--- a/Portfolio/COMP6841_Week_1_z5425064.docx
+++ b/Portfolio/COMP6841_Week_1_z5425064.docx
@@ -110,21 +110,12 @@
           <w:bCs/>
         </w:rPr>
       </w:pPr>
-      <w:proofErr w:type="spellStart"/>
       <w:r>
         <w:rPr>
           <w:b/>
           <w:bCs/>
         </w:rPr>
-        <w:t>zID</w:t>
-      </w:r>
-      <w:proofErr w:type="spellEnd"/>
-      <w:r>
-        <w:rPr>
-          <w:b/>
-          <w:bCs/>
-        </w:rPr>
-        <w:t>:</w:t>
+        <w:t>zID:</w:t>
       </w:r>
       <w:r>
         <w:rPr>
@@ -201,19 +192,7 @@
           <w:rPr>
             <w:rStyle w:val="Hyperlink"/>
           </w:rPr>
-          <w:t>Security Every</w:t>
-        </w:r>
-        <w:r>
-          <w:rPr>
-            <w:rStyle w:val="Hyperlink"/>
-          </w:rPr>
-          <w:t>w</w:t>
-        </w:r>
-        <w:r>
-          <w:rPr>
-            <w:rStyle w:val="Hyperlink"/>
-          </w:rPr>
-          <w:t>here</w:t>
+          <w:t>Security Everywhere</w:t>
         </w:r>
       </w:hyperlink>
     </w:p>
@@ -241,6 +220,9 @@
               </w:rPr>
             </w:pPr>
             <w:r>
+              <w:rPr>
+                <w:noProof/>
+              </w:rPr>
               <w:drawing>
                 <wp:anchor distT="0" distB="0" distL="114300" distR="114300" simplePos="0" relativeHeight="251663360" behindDoc="0" locked="0" layoutInCell="1" allowOverlap="1" wp14:anchorId="0976B908" wp14:editId="40E41E7C">
                   <wp:simplePos x="0" y="0"/>
@@ -350,21 +332,7 @@
               <w:rPr>
                 <w:lang w:val="en-AU"/>
               </w:rPr>
-              <w:t xml:space="preserve">, is a chip whose internal digital circuitry can be reconfigured after manufacturing, almost like a hardware </w:t>
-            </w:r>
-            <w:proofErr w:type="gramStart"/>
-            <w:r>
-              <w:rPr>
-                <w:lang w:val="en-AU"/>
-              </w:rPr>
-              <w:t>shape-shifter</w:t>
-            </w:r>
-            <w:proofErr w:type="gramEnd"/>
-            <w:r>
-              <w:rPr>
-                <w:lang w:val="en-AU"/>
-              </w:rPr>
-              <w:t xml:space="preserve"> customised for a specific task.</w:t>
+              <w:t>, is a chip whose internal digital circuitry can be reconfigured after manufacturing, almost like a hardware shape-shifter customised for a specific task.</w:t>
             </w:r>
           </w:p>
           <w:p>
@@ -504,19 +472,7 @@
                 <w:rPr>
                   <w:rStyle w:val="Hyperlink"/>
                 </w:rPr>
-                <w:t>https</w:t>
-              </w:r>
-              <w:r>
-                <w:rPr>
-                  <w:rStyle w:val="Hyperlink"/>
-                </w:rPr>
-                <w:t>:</w:t>
-              </w:r>
-              <w:r>
-                <w:rPr>
-                  <w:rStyle w:val="Hyperlink"/>
-                </w:rPr>
-                <w:t>//www.amd.com/en/resources/product-security/bulletin/amd-sb-8018.html</w:t>
+                <w:t>https://www.amd.com/en/resources/product-security/bulletin/amd-sb-8018.html</w:t>
               </w:r>
             </w:hyperlink>
             <w:r>
@@ -532,60 +488,7 @@
               <w:t xml:space="preserve">the </w:t>
             </w:r>
             <w:r>
-              <w:t xml:space="preserve">title </w:t>
-            </w:r>
-            <w:proofErr w:type="gramStart"/>
-            <w:r>
-              <w:t>is would be</w:t>
-            </w:r>
-            <w:proofErr w:type="gramEnd"/>
-            <w:r>
-              <w:t xml:space="preserve"> </w:t>
-            </w:r>
-            <w:proofErr w:type="gramStart"/>
-            <w:r>
-              <w:t>pretty boring</w:t>
-            </w:r>
-            <w:proofErr w:type="gramEnd"/>
-            <w:r>
-              <w:t xml:space="preserve"> as an image. </w:t>
-            </w:r>
-            <w:proofErr w:type="gramStart"/>
-            <w:r>
-              <w:t>So</w:t>
-            </w:r>
-            <w:proofErr w:type="gramEnd"/>
-            <w:r>
-              <w:t xml:space="preserve"> to spice things up I got AI to go on a bit of creative journey and try to make as many references about LOTR in the context of </w:t>
-            </w:r>
-            <w:proofErr w:type="spellStart"/>
-            <w:r>
-              <w:t>chypnosis</w:t>
-            </w:r>
-            <w:proofErr w:type="spellEnd"/>
-            <w:r>
-              <w:t xml:space="preserve"> as possible, it is a surprisingly good summary if you want a quick idea about what this is. (</w:t>
-            </w:r>
-            <w:proofErr w:type="gramStart"/>
-            <w:r>
-              <w:t>Also</w:t>
-            </w:r>
-            <w:proofErr w:type="gramEnd"/>
-            <w:r>
-              <w:t xml:space="preserve"> </w:t>
-            </w:r>
-            <w:proofErr w:type="spellStart"/>
-            <w:proofErr w:type="gramStart"/>
-            <w:r>
-              <w:t>their</w:t>
-            </w:r>
-            <w:proofErr w:type="gramEnd"/>
-            <w:r>
-              <w:t xml:space="preserve"> are</w:t>
-            </w:r>
-            <w:proofErr w:type="spellEnd"/>
-            <w:r>
-              <w:t xml:space="preserve"> lots of erro</w:t>
+              <w:t>title is would be pretty boring as an image. So to spice things up I got AI to go on a bit of creative journey and try to make as many references about LOTR in the context of chypnosis as possible, it is a surprisingly good summary if you want a quick idea about what this is. (Also their are lots of erro</w:t>
             </w:r>
             <w:r>
               <w:t>r</w:t>
@@ -707,16 +610,23 @@
           <w:tcPr>
             <w:tcW w:w="9360" w:type="dxa"/>
           </w:tcPr>
-          <w:p/>
           <w:p>
             <w:r>
               <w:rPr>
                 <w:noProof/>
               </w:rPr>
               <w:drawing>
-                <wp:inline distT="0" distB="0" distL="0" distR="0" wp14:anchorId="694F498F" wp14:editId="27D58AFD">
-                  <wp:extent cx="4758855" cy="3569269"/>
-                  <wp:effectExtent l="0" t="0" r="3810" b="0"/>
+                <wp:anchor distT="0" distB="0" distL="114300" distR="114300" simplePos="0" relativeHeight="251664384" behindDoc="0" locked="0" layoutInCell="1" allowOverlap="1" wp14:anchorId="7FC6B3C2" wp14:editId="58D98F94">
+                  <wp:simplePos x="0" y="0"/>
+                  <wp:positionH relativeFrom="column">
+                    <wp:posOffset>456025</wp:posOffset>
+                  </wp:positionH>
+                  <wp:positionV relativeFrom="paragraph">
+                    <wp:posOffset>1861820</wp:posOffset>
+                  </wp:positionV>
+                  <wp:extent cx="5156200" cy="3867150"/>
+                  <wp:effectExtent l="0" t="0" r="6350" b="0"/>
+                  <wp:wrapSquare wrapText="bothSides"/>
                   <wp:docPr id="1880590117" name="Picture 3"/>
                   <wp:cNvGraphicFramePr>
                     <a:graphicFrameLocks xmlns:a="http://schemas.openxmlformats.org/drawingml/2006/main" noChangeAspect="1"/>
@@ -746,7 +656,7 @@
                         <pic:spPr bwMode="auto">
                           <a:xfrm>
                             <a:off x="0" y="0"/>
-                            <a:ext cx="4762735" cy="3572179"/>
+                            <a:ext cx="5156200" cy="3867150"/>
                           </a:xfrm>
                           <a:prstGeom prst="rect">
                             <a:avLst/>
@@ -759,17 +669,630 @@
                       </pic:pic>
                     </a:graphicData>
                   </a:graphic>
-                </wp:inline>
+                </wp:anchor>
               </w:drawing>
             </w:r>
             <w:r>
+              <w:t xml:space="preserve">As a </w:t>
+            </w:r>
+            <w:r>
+              <w:t>b</w:t>
+            </w:r>
+            <w:r>
+              <w:t xml:space="preserve">luetooth </w:t>
+            </w:r>
+            <w:r>
+              <w:t>experiment,</w:t>
+            </w:r>
+            <w:r>
+              <w:t xml:space="preserve"> I decided to look into how a device could do localisation with Bluetooth signal strength. There has been lots of research using Bluetooth tags to map out the location of a person based on signal strength, channel sounding etc. I wanted to test out how good it is with COT(Commodity Off shelf Technology ) device. To do this experiment quickly and thoroughly I decided to use the Nordic NRF Connect App on the Appstore as I have used it before and Nordic themselves are one of the main </w:t>
+            </w:r>
+            <w:r>
+              <w:t xml:space="preserve">manufacturers </w:t>
+            </w:r>
+            <w:r>
+              <w:t xml:space="preserve">of BLE chipsets. </w:t>
+            </w:r>
+            <w:r>
+              <w:t xml:space="preserve"> I like the app because it has an RSSI plot overtime which makes it easier to see trends. With some initial testing this is initially what the plot looked like</w:t>
+            </w:r>
+            <w:r>
+              <w:t xml:space="preserve"> just remaining static, which as you can see is very busy and confusing and hard to find any meaningful sort of information from.</w:t>
+            </w:r>
+            <w:r>
+              <w:t xml:space="preserve"> </w:t>
+            </w:r>
+          </w:p>
+          <w:p/>
+          <w:p/>
+          <w:p/>
+          <w:p/>
+          <w:p/>
+          <w:p/>
+          <w:p/>
+          <w:p/>
+          <w:p/>
+          <w:p/>
+          <w:p/>
+          <w:p/>
+          <w:p/>
+          <w:p/>
+          <w:p/>
+          <w:p/>
+          <w:p/>
+          <w:p/>
+          <w:p/>
+          <w:p/>
+          <w:p/>
+          <w:p>
+            <w:r>
+              <w:t xml:space="preserve">Therefore, I decided to use the mathematical model of the RSSI value </w:t>
+            </w:r>
+            <w:r>
+              <w:t xml:space="preserve">so that I can use a threshold to filter out devices in proximity to me ,this can be shown </w:t>
+            </w:r>
+            <w:r>
+              <w:t>in the Friis Transmission Equation:</w:t>
+            </w:r>
+          </w:p>
+          <w:p>
+            <m:oMathPara>
+              <m:oMath>
+                <m:f>
+                  <m:fPr>
+                    <m:ctrlPr>
+                      <w:rPr>
+                        <w:rFonts w:ascii="Cambria Math" w:hAnsi="Cambria Math"/>
+                      </w:rPr>
+                    </m:ctrlPr>
+                  </m:fPr>
+                  <m:num>
+                    <m:sSub>
+                      <m:sSubPr>
+                        <m:ctrlPr>
+                          <w:rPr>
+                            <w:rFonts w:ascii="Cambria Math" w:hAnsi="Cambria Math"/>
+                          </w:rPr>
+                        </m:ctrlPr>
+                      </m:sSubPr>
+                      <m:e>
+                        <m:r>
+                          <w:rPr>
+                            <w:rFonts w:ascii="Cambria Math" w:hAnsi="Cambria Math"/>
+                          </w:rPr>
+                          <m:t>P</m:t>
+                        </m:r>
+                      </m:e>
+                      <m:sub>
+                        <m:r>
+                          <w:rPr>
+                            <w:rFonts w:ascii="Cambria Math" w:hAnsi="Cambria Math"/>
+                          </w:rPr>
+                          <m:t>r</m:t>
+                        </m:r>
+                      </m:sub>
+                    </m:sSub>
+                  </m:num>
+                  <m:den>
+                    <m:sSub>
+                      <m:sSubPr>
+                        <m:ctrlPr>
+                          <w:rPr>
+                            <w:rFonts w:ascii="Cambria Math" w:hAnsi="Cambria Math"/>
+                          </w:rPr>
+                        </m:ctrlPr>
+                      </m:sSubPr>
+                      <m:e>
+                        <m:r>
+                          <w:rPr>
+                            <w:rFonts w:ascii="Cambria Math" w:hAnsi="Cambria Math"/>
+                          </w:rPr>
+                          <m:t>P</m:t>
+                        </m:r>
+                      </m:e>
+                      <m:sub>
+                        <m:r>
+                          <w:rPr>
+                            <w:rFonts w:ascii="Cambria Math" w:hAnsi="Cambria Math"/>
+                          </w:rPr>
+                          <m:t>t</m:t>
+                        </m:r>
+                      </m:sub>
+                    </m:sSub>
+                  </m:den>
+                </m:f>
+                <m:r>
+                  <w:rPr>
+                    <w:rFonts w:ascii="Cambria Math" w:hAnsi="Cambria Math"/>
+                  </w:rPr>
+                  <m:t>=</m:t>
+                </m:r>
+                <m:sSub>
+                  <m:sSubPr>
+                    <m:ctrlPr>
+                      <w:rPr>
+                        <w:rFonts w:ascii="Cambria Math" w:hAnsi="Cambria Math"/>
+                        <w:i/>
+                      </w:rPr>
+                    </m:ctrlPr>
+                  </m:sSubPr>
+                  <m:e>
+                    <m:r>
+                      <w:rPr>
+                        <w:rFonts w:ascii="Cambria Math" w:hAnsi="Cambria Math"/>
+                      </w:rPr>
+                      <m:t>G</m:t>
+                    </m:r>
+                  </m:e>
+                  <m:sub>
+                    <m:r>
+                      <w:rPr>
+                        <w:rFonts w:ascii="Cambria Math" w:hAnsi="Cambria Math"/>
+                      </w:rPr>
+                      <m:t>r</m:t>
+                    </m:r>
+                  </m:sub>
+                </m:sSub>
+                <m:sSub>
+                  <m:sSubPr>
+                    <m:ctrlPr>
+                      <w:rPr>
+                        <w:rFonts w:ascii="Cambria Math" w:hAnsi="Cambria Math"/>
+                        <w:i/>
+                      </w:rPr>
+                    </m:ctrlPr>
+                  </m:sSubPr>
+                  <m:e>
+                    <m:r>
+                      <w:rPr>
+                        <w:rFonts w:ascii="Cambria Math" w:hAnsi="Cambria Math"/>
+                      </w:rPr>
+                      <m:t>G</m:t>
+                    </m:r>
+                  </m:e>
+                  <m:sub>
+                    <m:r>
+                      <w:rPr>
+                        <w:rFonts w:ascii="Cambria Math" w:hAnsi="Cambria Math"/>
+                      </w:rPr>
+                      <m:t>t</m:t>
+                    </m:r>
+                  </m:sub>
+                </m:sSub>
+                <m:sSup>
+                  <m:sSupPr>
+                    <m:ctrlPr>
+                      <w:rPr>
+                        <w:rFonts w:ascii="Cambria Math" w:hAnsi="Cambria Math"/>
+                        <w:i/>
+                      </w:rPr>
+                    </m:ctrlPr>
+                  </m:sSupPr>
+                  <m:e>
+                    <m:d>
+                      <m:dPr>
+                        <m:ctrlPr>
+                          <w:rPr>
+                            <w:rFonts w:ascii="Cambria Math" w:hAnsi="Cambria Math"/>
+                            <w:i/>
+                          </w:rPr>
+                        </m:ctrlPr>
+                      </m:dPr>
+                      <m:e>
+                        <m:f>
+                          <m:fPr>
+                            <m:ctrlPr>
+                              <w:rPr>
+                                <w:rFonts w:ascii="Cambria Math" w:hAnsi="Cambria Math"/>
+                                <w:i/>
+                              </w:rPr>
+                            </m:ctrlPr>
+                          </m:fPr>
+                          <m:num>
+                            <m:r>
+                              <w:rPr>
+                                <w:rFonts w:ascii="Cambria Math" w:hAnsi="Cambria Math"/>
+                              </w:rPr>
+                              <m:t>λ</m:t>
+                            </m:r>
+                          </m:num>
+                          <m:den>
+                            <m:r>
+                              <w:rPr>
+                                <w:rFonts w:ascii="Cambria Math" w:hAnsi="Cambria Math"/>
+                              </w:rPr>
+                              <m:t>4πd</m:t>
+                            </m:r>
+                          </m:den>
+                        </m:f>
+                      </m:e>
+                    </m:d>
+                  </m:e>
+                  <m:sup>
+                    <m:r>
+                      <w:rPr>
+                        <w:rFonts w:ascii="Cambria Math" w:hAnsi="Cambria Math"/>
+                      </w:rPr>
+                      <m:t>2</m:t>
+                    </m:r>
+                  </m:sup>
+                </m:sSup>
+              </m:oMath>
+            </m:oMathPara>
+          </w:p>
+          <w:p>
+            <w:r>
+              <w:t xml:space="preserve">Where </w:t>
+            </w:r>
+            <m:oMath>
+              <m:sSub>
+                <m:sSubPr>
+                  <m:ctrlPr>
+                    <w:rPr>
+                      <w:rFonts w:ascii="Cambria Math" w:hAnsi="Cambria Math"/>
+                      <w:i/>
+                    </w:rPr>
+                  </m:ctrlPr>
+                </m:sSubPr>
+                <m:e>
+                  <m:r>
+                    <w:rPr>
+                      <w:rFonts w:ascii="Cambria Math" w:hAnsi="Cambria Math"/>
+                    </w:rPr>
+                    <m:t>P</m:t>
+                  </m:r>
+                </m:e>
+                <m:sub>
+                  <m:r>
+                    <w:rPr>
+                      <w:rFonts w:ascii="Cambria Math" w:hAnsi="Cambria Math"/>
+                    </w:rPr>
+                    <m:t>r</m:t>
+                  </m:r>
+                </m:sub>
+              </m:sSub>
+            </m:oMath>
+            <w:r>
+              <w:t xml:space="preserve"> is the received power, </w:t>
+            </w:r>
+            <m:oMath>
+              <m:sSub>
+                <m:sSubPr>
+                  <m:ctrlPr>
+                    <w:rPr>
+                      <w:rFonts w:ascii="Cambria Math" w:hAnsi="Cambria Math"/>
+                      <w:i/>
+                    </w:rPr>
+                  </m:ctrlPr>
+                </m:sSubPr>
+                <m:e>
+                  <m:r>
+                    <w:rPr>
+                      <w:rFonts w:ascii="Cambria Math" w:hAnsi="Cambria Math"/>
+                    </w:rPr>
+                    <m:t>P</m:t>
+                  </m:r>
+                </m:e>
+                <m:sub>
+                  <m:r>
+                    <w:rPr>
+                      <w:rFonts w:ascii="Cambria Math" w:hAnsi="Cambria Math"/>
+                    </w:rPr>
+                    <m:t>t</m:t>
+                  </m:r>
+                </m:sub>
+              </m:sSub>
+            </m:oMath>
+            <w:r>
+              <w:t xml:space="preserve"> is the transmitted power, </w:t>
+            </w:r>
+            <m:oMath>
+              <m:sSub>
+                <m:sSubPr>
+                  <m:ctrlPr>
+                    <w:rPr>
+                      <w:rFonts w:ascii="Cambria Math" w:hAnsi="Cambria Math"/>
+                      <w:i/>
+                    </w:rPr>
+                  </m:ctrlPr>
+                </m:sSubPr>
+                <m:e>
+                  <m:r>
+                    <w:rPr>
+                      <w:rFonts w:ascii="Cambria Math" w:hAnsi="Cambria Math"/>
+                    </w:rPr>
+                    <m:t>G</m:t>
+                  </m:r>
+                </m:e>
+                <m:sub>
+                  <m:r>
+                    <w:rPr>
+                      <w:rFonts w:ascii="Cambria Math" w:hAnsi="Cambria Math"/>
+                    </w:rPr>
+                    <m:t>r</m:t>
+                  </m:r>
+                </m:sub>
+              </m:sSub>
+            </m:oMath>
+            <w:r>
+              <w:t xml:space="preserve"> is the received antenna gain,  </w:t>
+            </w:r>
+            <m:oMath>
+              <m:sSub>
+                <m:sSubPr>
+                  <m:ctrlPr>
+                    <w:rPr>
+                      <w:rFonts w:ascii="Cambria Math" w:hAnsi="Cambria Math"/>
+                      <w:i/>
+                    </w:rPr>
+                  </m:ctrlPr>
+                </m:sSubPr>
+                <m:e>
+                  <m:r>
+                    <w:rPr>
+                      <w:rFonts w:ascii="Cambria Math" w:hAnsi="Cambria Math"/>
+                    </w:rPr>
+                    <m:t>G</m:t>
+                  </m:r>
+                </m:e>
+                <m:sub>
+                  <m:r>
+                    <w:rPr>
+                      <w:rFonts w:ascii="Cambria Math" w:hAnsi="Cambria Math"/>
+                    </w:rPr>
+                    <m:t>t</m:t>
+                  </m:r>
+                </m:sub>
+              </m:sSub>
+            </m:oMath>
+            <w:r>
+              <w:t xml:space="preserve">is the transmitted antenna’s gain, </w:t>
+            </w:r>
+            <m:oMath>
+              <m:r>
+                <w:rPr>
+                  <w:rFonts w:ascii="Cambria Math" w:hAnsi="Cambria Math"/>
+                </w:rPr>
+                <m:t>λ</m:t>
+              </m:r>
+            </m:oMath>
+            <w:r>
+              <w:t xml:space="preserve"> is the wavelength and </w:t>
+            </w:r>
+            <m:oMath>
+              <m:r>
+                <w:rPr>
+                  <w:rFonts w:ascii="Cambria Math" w:hAnsi="Cambria Math"/>
+                </w:rPr>
+                <m:t>d</m:t>
+              </m:r>
+            </m:oMath>
+            <w:r>
+              <w:t xml:space="preserve"> is the distance between the transmitter and receiver.</w:t>
+            </w:r>
+            <w:r>
+              <w:t xml:space="preserve"> Now using this equation I make the assumption </w:t>
+            </w:r>
+            <w:r>
+              <w:lastRenderedPageBreak/>
+              <w:t xml:space="preserve">that the antenna gain is approximately 1 since most BLE nodes want a to have as close to isotropic radiation pattern as they can get, as they cannot assume the placement of the device with respect to a receiver. Therefore, the free space path loss in db can be approximated as: </w:t>
+            </w:r>
+          </w:p>
+          <w:p>
+            <m:oMathPara>
+              <m:oMath>
+                <m:r>
+                  <w:rPr>
+                    <w:rFonts w:ascii="Cambria Math" w:hAnsi="Cambria Math"/>
+                  </w:rPr>
+                  <m:t>FSPL= 20</m:t>
+                </m:r>
+                <m:func>
+                  <m:funcPr>
+                    <m:ctrlPr>
+                      <w:rPr>
+                        <w:rFonts w:ascii="Cambria Math" w:hAnsi="Cambria Math"/>
+                        <w:i/>
+                      </w:rPr>
+                    </m:ctrlPr>
+                  </m:funcPr>
+                  <m:fName>
+                    <m:r>
+                      <m:rPr>
+                        <m:sty m:val="p"/>
+                      </m:rPr>
+                      <w:rPr>
+                        <w:rFonts w:ascii="Cambria Math" w:hAnsi="Cambria Math"/>
+                      </w:rPr>
+                      <m:t>log</m:t>
+                    </m:r>
+                  </m:fName>
+                  <m:e>
+                    <m:r>
+                      <w:rPr>
+                        <w:rFonts w:ascii="Cambria Math" w:hAnsi="Cambria Math"/>
+                      </w:rPr>
+                      <m:t>(</m:t>
+                    </m:r>
+                    <m:f>
+                      <m:fPr>
+                        <m:ctrlPr>
+                          <w:rPr>
+                            <w:rFonts w:ascii="Cambria Math" w:hAnsi="Cambria Math"/>
+                            <w:i/>
+                          </w:rPr>
+                        </m:ctrlPr>
+                      </m:fPr>
+                      <m:num>
+                        <m:r>
+                          <w:rPr>
+                            <w:rFonts w:ascii="Cambria Math" w:hAnsi="Cambria Math"/>
+                          </w:rPr>
+                          <m:t>4πd</m:t>
+                        </m:r>
+                      </m:num>
+                      <m:den>
+                        <m:r>
+                          <w:rPr>
+                            <w:rFonts w:ascii="Cambria Math" w:hAnsi="Cambria Math"/>
+                          </w:rPr>
+                          <m:t>λ</m:t>
+                        </m:r>
+                      </m:den>
+                    </m:f>
+                    <m:r>
+                      <w:rPr>
+                        <w:rFonts w:ascii="Cambria Math" w:hAnsi="Cambria Math"/>
+                      </w:rPr>
+                      <m:t>)</m:t>
+                    </m:r>
+                  </m:e>
+                </m:func>
+              </m:oMath>
+            </m:oMathPara>
+          </w:p>
+          <w:p>
+            <w:r>
+              <w:t>Now I want to localize myself to a room that I am in</w:t>
+            </w:r>
+            <w:r>
+              <w:t>, hence I made the assumption of approximately wanting to see device within 2 meters of my location</w:t>
+            </w:r>
+            <w:r>
+              <w:t xml:space="preserve">, hence by plugging in the numbers (BLE is 2.4GHz), I found that </w:t>
+            </w:r>
+            <w:r>
+              <w:t>the path loss should be approximately 46dB</w:t>
+            </w:r>
+            <w:r>
+              <w:t>, considering the additional losses of radiation efficiency which is generally 30% for low budget devices that we will be considering which is an additional 5dB in loss. In addition to account for further obstacles and things I will add another 4dB in loss</w:t>
+            </w:r>
+            <w:r>
+              <w:t>.</w:t>
+            </w:r>
+            <w:r>
+              <w:t xml:space="preserve"> </w:t>
+            </w:r>
+            <w:r>
+              <w:t xml:space="preserve">Overall we therefore would expect approximately a 55dB loss to the signal. Furthermore, we assume for most standard devices the transmit power is about 1mW or 0dBm. Therefore, by using the 55dB figure we have a much less chaotic and busy view of devices and can start to localize my movements. </w:t>
+            </w:r>
+          </w:p>
+          <w:p/>
+          <w:p>
+            <w:r>
+              <w:t xml:space="preserve">A rough floor plan of my house and device placement is as </w:t>
+            </w:r>
+            <w:r>
+              <w:t>shown below</w:t>
+            </w:r>
+            <w:r>
+              <w:t xml:space="preserve"> </w:t>
+            </w:r>
+            <w:r>
+              <w:t>(without oversharing</w:t>
+            </w:r>
+            <w:r>
+              <w:t xml:space="preserve"> that much</w:t>
+            </w:r>
+            <w:r>
+              <w:t>)</w:t>
+            </w:r>
+            <w:r>
+              <w:t>, with my path in blue each stage numbered and the key devices shown to match the respective trace colours on the application.</w:t>
+            </w:r>
+          </w:p>
+          <w:p>
+            <w:r>
+              <w:drawing>
+                <wp:anchor distT="0" distB="0" distL="114300" distR="114300" simplePos="0" relativeHeight="251665408" behindDoc="1" locked="0" layoutInCell="1" allowOverlap="1" wp14:anchorId="4FE6C236" wp14:editId="1F6C7FC8">
+                  <wp:simplePos x="0" y="0"/>
+                  <wp:positionH relativeFrom="column">
+                    <wp:posOffset>689821</wp:posOffset>
+                  </wp:positionH>
+                  <wp:positionV relativeFrom="paragraph">
+                    <wp:posOffset>49530</wp:posOffset>
+                  </wp:positionV>
+                  <wp:extent cx="4170680" cy="2576195"/>
+                  <wp:effectExtent l="0" t="0" r="1270" b="0"/>
+                  <wp:wrapSquare wrapText="bothSides"/>
+                  <wp:docPr id="1704317118" name="Picture 1"/>
+                  <wp:cNvGraphicFramePr>
+                    <a:graphicFrameLocks xmlns:a="http://schemas.openxmlformats.org/drawingml/2006/main" noChangeAspect="1"/>
+                  </wp:cNvGraphicFramePr>
+                  <a:graphic xmlns:a="http://schemas.openxmlformats.org/drawingml/2006/main">
+                    <a:graphicData uri="http://schemas.openxmlformats.org/drawingml/2006/picture">
+                      <pic:pic xmlns:pic="http://schemas.openxmlformats.org/drawingml/2006/picture">
+                        <pic:nvPicPr>
+                          <pic:cNvPr id="1704317118" name=""/>
+                          <pic:cNvPicPr/>
+                        </pic:nvPicPr>
+                        <pic:blipFill>
+                          <a:blip r:embed="rId13" cstate="print">
+                            <a:extLst>
+                              <a:ext uri="{28A0092B-C50C-407E-A947-70E740481C1C}">
+                                <a14:useLocalDpi xmlns:a14="http://schemas.microsoft.com/office/drawing/2010/main" val="0"/>
+                              </a:ext>
+                            </a:extLst>
+                          </a:blip>
+                          <a:stretch>
+                            <a:fillRect/>
+                          </a:stretch>
+                        </pic:blipFill>
+                        <pic:spPr>
+                          <a:xfrm>
+                            <a:off x="0" y="0"/>
+                            <a:ext cx="4170680" cy="2576195"/>
+                          </a:xfrm>
+                          <a:prstGeom prst="rect">
+                            <a:avLst/>
+                          </a:prstGeom>
+                        </pic:spPr>
+                      </pic:pic>
+                    </a:graphicData>
+                  </a:graphic>
+                </wp:anchor>
+              </w:drawing>
+            </w:r>
+          </w:p>
+          <w:p/>
+          <w:p/>
+          <w:p/>
+          <w:p/>
+          <w:p/>
+          <w:p/>
+          <w:p/>
+          <w:p/>
+          <w:p/>
+          <w:p/>
+          <w:p/>
+          <w:p/>
+          <w:p/>
+          <w:p>
+            <w:pPr>
               <w:rPr>
                 <w:noProof/>
               </w:rPr>
+            </w:pPr>
+          </w:p>
+          <w:p>
+            <w:r>
+              <w:t>The results of this experiment, show a clear distinction of my location in each rooms. This can be seen in the RSSI plot on the application. This can be a concerning security vulnerability since these device could track off my device such as a phone or watch to monitor my whereabouts and report it to others. This data could then be processed to determine when I am not home or sleep that either a software attack or physical attack could b</w:t>
+            </w:r>
+            <w:r>
+              <w:t xml:space="preserve">e started. And may become a reconnaissance technology. </w:t>
+            </w:r>
+          </w:p>
+          <w:p/>
+          <w:p>
+            <w:r>
+              <w:rPr>
+                <w:noProof/>
+              </w:rPr>
+              <w:lastRenderedPageBreak/>
               <w:drawing>
-                <wp:inline distT="0" distB="0" distL="0" distR="0" wp14:anchorId="3DA0436E" wp14:editId="7D0E4763">
-                  <wp:extent cx="4712379" cy="3534410"/>
-                  <wp:effectExtent l="0" t="0" r="0" b="8890"/>
+                <wp:inline distT="0" distB="0" distL="0" distR="0" wp14:anchorId="54FC7092" wp14:editId="73777597">
+                  <wp:extent cx="5257613" cy="3812117"/>
+                  <wp:effectExtent l="0" t="0" r="635" b="0"/>
                   <wp:docPr id="512924334" name="Picture 2"/>
                   <wp:cNvGraphicFramePr>
                     <a:graphicFrameLocks xmlns:a="http://schemas.openxmlformats.org/drawingml/2006/main" noChangeAspect="1"/>
@@ -783,15 +1306,15 @@
                             <a:picLocks noChangeAspect="1" noChangeArrowheads="1"/>
                           </pic:cNvPicPr>
                         </pic:nvPicPr>
-                        <pic:blipFill>
-                          <a:blip r:embed="rId13" cstate="print">
+                        <pic:blipFill rotWithShape="1">
+                          <a:blip r:embed="rId14" cstate="print">
                             <a:extLst>
                               <a:ext uri="{28A0092B-C50C-407E-A947-70E740481C1C}">
                                 <a14:useLocalDpi xmlns:a14="http://schemas.microsoft.com/office/drawing/2010/main" val="0"/>
                               </a:ext>
                             </a:extLst>
                           </a:blip>
-                          <a:srcRect/>
+                          <a:srcRect t="3328"/>
                           <a:stretch>
                             <a:fillRect/>
                           </a:stretch>
@@ -799,7 +1322,7 @@
                         <pic:spPr bwMode="auto">
                           <a:xfrm>
                             <a:off x="0" y="0"/>
-                            <a:ext cx="4733811" cy="3550485"/>
+                            <a:ext cx="5285932" cy="3832650"/>
                           </a:xfrm>
                           <a:prstGeom prst="rect">
                             <a:avLst/>
@@ -808,6 +1331,11 @@
                           <a:ln>
                             <a:noFill/>
                           </a:ln>
+                          <a:extLst>
+                            <a:ext uri="{53640926-AAD7-44D8-BBD7-CCE9431645EC}">
+                              <a14:shadowObscured xmlns:a14="http://schemas.microsoft.com/office/drawing/2010/main"/>
+                            </a:ext>
+                          </a:extLst>
                         </pic:spPr>
                       </pic:pic>
                     </a:graphicData>
@@ -817,14 +1345,50 @@
             </w:r>
           </w:p>
           <w:p/>
-          <w:p/>
-          <w:p/>
           <w:p>
             <w:pPr>
               <w:rPr>
                 <w:rFonts w:ascii="Aptos" w:eastAsia="Aptos" w:hAnsi="Aptos" w:cs="Aptos"/>
               </w:rPr>
             </w:pPr>
+            <w:r>
+              <w:rPr>
+                <w:rFonts w:ascii="Aptos" w:eastAsia="Aptos" w:hAnsi="Aptos" w:cs="Aptos"/>
+              </w:rPr>
+              <w:t xml:space="preserve">From a different perspective, there is a greater problem with this issue which has been recently addressed. There may be cases when we only want to interact with a user if they are </w:t>
+            </w:r>
+            <w:r>
+              <w:rPr>
+                <w:rFonts w:ascii="Aptos" w:eastAsia="Aptos" w:hAnsi="Aptos" w:cs="Aptos"/>
+                <w:i/>
+                <w:iCs/>
+              </w:rPr>
+              <w:t>“close enough”</w:t>
+            </w:r>
+            <w:r>
+              <w:rPr>
+                <w:rFonts w:ascii="Aptos" w:eastAsia="Aptos" w:hAnsi="Aptos" w:cs="Aptos"/>
+              </w:rPr>
+              <w:t xml:space="preserve"> to the device (e.g a smart lock) or are the closest. The RSSI signals vary significantly and have a lot of noise, so thresholding may be unreliable, additionally notice the difference in power between the phone and the bedroom devices, this can come down to a few factors such as the transmit power and antenna design. This can allow our assumption of the transmit power to be exploited, and an adversary may increase their power so that our program may believe the device they are using is closer than they actually are and allow them to say unlock a door without being caught on camera. Recently, this was considered a major security risk (imagine a person driving by in their car unlocking everybody’s doors with their maximum tint and sunglasses), the alternative to using the power was what the Bluetooth SIG introduced as </w:t>
+            </w:r>
+            <w:r>
+              <w:rPr>
+                <w:rFonts w:ascii="Aptos" w:eastAsia="Aptos" w:hAnsi="Aptos" w:cs="Aptos"/>
+              </w:rPr>
+              <w:t xml:space="preserve">channel sounding, which uses the phase and time delay of signals to estimate the </w:t>
+            </w:r>
+            <w:r>
+              <w:rPr>
+                <w:rFonts w:ascii="Aptos" w:eastAsia="Aptos" w:hAnsi="Aptos" w:cs="Aptos"/>
+              </w:rPr>
+              <w:t xml:space="preserve"> </w:t>
+            </w:r>
+            <w:r>
+              <w:rPr>
+                <w:rFonts w:ascii="Aptos" w:eastAsia="Aptos" w:hAnsi="Aptos" w:cs="Aptos"/>
+              </w:rPr>
+              <w:t>distance of a person. Whilst this is not unbreakable it certainly makes it much more difficult for an adversary rather than having an amplifier boost the signal.</w:t>
+            </w:r>
           </w:p>
         </w:tc>
       </w:tr>
@@ -840,24 +1404,12 @@
       <w:pPr>
         <w:pStyle w:val="Heading2"/>
       </w:pPr>
-      <w:hyperlink r:id="rId14">
+      <w:hyperlink r:id="rId15">
         <w:r>
           <w:rPr>
             <w:rStyle w:val="Hyperlink"/>
           </w:rPr>
-          <w:t xml:space="preserve">Physical </w:t>
-        </w:r>
-        <w:r>
-          <w:rPr>
-            <w:rStyle w:val="Hyperlink"/>
-          </w:rPr>
-          <w:t>S</w:t>
-        </w:r>
-        <w:r>
-          <w:rPr>
-            <w:rStyle w:val="Hyperlink"/>
-          </w:rPr>
-          <w:t>ecurity</w:t>
+          <w:t>Physical Security</w:t>
         </w:r>
       </w:hyperlink>
     </w:p>
@@ -908,7 +1460,7 @@
       <w:pPr>
         <w:pStyle w:val="Heading2"/>
       </w:pPr>
-      <w:hyperlink r:id="rId15">
+      <w:hyperlink r:id="rId16">
         <w:r>
           <w:rPr>
             <w:rStyle w:val="Hyperlink"/>
@@ -973,7 +1525,7 @@
       <w:pPr>
         <w:pStyle w:val="Heading2"/>
       </w:pPr>
-      <w:hyperlink r:id="rId16">
+      <w:hyperlink r:id="rId17">
         <w:r>
           <w:rPr>
             <w:rStyle w:val="Hyperlink"/>
@@ -1001,25 +1553,7 @@
           </w:tcPr>
           <w:p>
             <w:r>
-              <w:t xml:space="preserve">During this </w:t>
-            </w:r>
-            <w:proofErr w:type="spellStart"/>
-            <w:proofErr w:type="gramStart"/>
-            <w:r>
-              <w:t>weeks</w:t>
-            </w:r>
-            <w:proofErr w:type="spellEnd"/>
-            <w:proofErr w:type="gramEnd"/>
-            <w:r>
-              <w:t xml:space="preserve"> war </w:t>
-            </w:r>
-            <w:proofErr w:type="gramStart"/>
-            <w:r>
-              <w:t>games</w:t>
-            </w:r>
-            <w:proofErr w:type="gramEnd"/>
-            <w:r>
-              <w:t xml:space="preserve"> I learnt a lot of different methods of SQL injection. I found that the underlying weakness comes in the nuance of how the user code is added to the SQL command. If a direct string entry is added it gives the user the ability to change the overall command beyond the intention of an argument, this can be exploited to change the security logic of databases and grant access to adversaries. </w:t>
+              <w:t xml:space="preserve">During this weeks war games I learnt a lot of different methods of SQL injection. I found that the underlying weakness comes in the nuance of how the user code is added to the SQL command. If a direct string entry is added it gives the user the ability to change the overall command beyond the intention of an argument, this can be exploited to change the security logic of databases and grant access to adversaries. </w:t>
             </w:r>
           </w:p>
           <w:p/>
@@ -1028,7 +1562,6 @@
               <w:pStyle w:val="Heading2"/>
             </w:pPr>
             <w:r>
-              <w:lastRenderedPageBreak/>
               <w:t>SQLi 1</w:t>
             </w:r>
           </w:p>
@@ -1098,6 +1631,7 @@
               <w:rPr>
                 <w:noProof/>
               </w:rPr>
+              <w:lastRenderedPageBreak/>
               <w:drawing>
                 <wp:inline distT="0" distB="0" distL="0" distR="0" wp14:anchorId="4A401A5A" wp14:editId="183FC504">
                   <wp:extent cx="5943600" cy="1528445"/>
@@ -1114,7 +1648,7 @@
                           <pic:cNvPicPr/>
                         </pic:nvPicPr>
                         <pic:blipFill>
-                          <a:blip r:embed="rId17"/>
+                          <a:blip r:embed="rId18"/>
                           <a:stretch>
                             <a:fillRect/>
                           </a:stretch>
@@ -1164,21 +1698,8 @@
             <w:pPr>
               <w:pStyle w:val="Quote"/>
             </w:pPr>
-            <w:proofErr w:type="gramStart"/>
-            <w:r>
-              <w:t>“ OR</w:t>
-            </w:r>
-            <w:proofErr w:type="gramEnd"/>
-            <w:r>
-              <w:t xml:space="preserve"> “</w:t>
-            </w:r>
-            <w:proofErr w:type="gramStart"/>
-            <w:r>
-              <w:t>1”=</w:t>
-            </w:r>
-            <w:proofErr w:type="gramEnd"/>
-            <w:r>
-              <w:t>”1</w:t>
+            <w:r>
+              <w:t>“ OR “1”=”1</w:t>
             </w:r>
           </w:p>
           <w:p/>
@@ -1190,7 +1711,6 @@
               <w:rPr>
                 <w:noProof/>
               </w:rPr>
-              <w:lastRenderedPageBreak/>
               <w:drawing>
                 <wp:inline distT="0" distB="0" distL="0" distR="0" wp14:anchorId="6175E785" wp14:editId="033FB495">
                   <wp:extent cx="5410883" cy="3160395"/>
@@ -1207,7 +1727,7 @@
                           <pic:cNvPicPr/>
                         </pic:nvPicPr>
                         <pic:blipFill>
-                          <a:blip r:embed="rId18"/>
+                          <a:blip r:embed="rId19"/>
                           <a:stretch>
                             <a:fillRect/>
                           </a:stretch>
@@ -1258,15 +1778,8 @@
               </w:rPr>
             </w:pPr>
             <w:r>
-              <w:t xml:space="preserve">The username entry will be swapped in, whereas the password is added as an argument. While both are used in the query, the handling is very different. The username is inserted directly into the query, </w:t>
-            </w:r>
-            <w:proofErr w:type="gramStart"/>
-            <w:r>
-              <w:t>similar to</w:t>
-            </w:r>
-            <w:proofErr w:type="gramEnd"/>
-            <w:r>
-              <w:t xml:space="preserve"> SQLi 1, whereas the password is passed as an argument to the function and does not alter the query itself.</w:t>
+              <w:lastRenderedPageBreak/>
+              <w:t>The username entry will be swapped in, whereas the password is added as an argument. While both are used in the query, the handling is very different. The username is inserted directly into the query, similar to SQLi 1, whereas the password is passed as an argument to the function and does not alter the query itself.</w:t>
             </w:r>
           </w:p>
           <w:p>
@@ -1288,39 +1801,7 @@
               <w:t>we want to login without logging in.</w:t>
             </w:r>
             <w:r>
-              <w:t xml:space="preserve"> We have two ways to get through: directly or around it. Breaking the validation itself with another password or brute force is slow and annoying, so it is easier to go around it. We can edit the </w:t>
-            </w:r>
-            <w:proofErr w:type="gramStart"/>
-            <w:r>
-              <w:t>query</w:t>
-            </w:r>
-            <w:proofErr w:type="gramEnd"/>
-            <w:r>
-              <w:t xml:space="preserve"> so the password is </w:t>
-            </w:r>
-            <w:proofErr w:type="gramStart"/>
-            <w:r>
-              <w:t>ignored</w:t>
-            </w:r>
-            <w:proofErr w:type="gramEnd"/>
-            <w:r>
-              <w:t xml:space="preserve"> and the username is cancelled out by a permanently true statement. </w:t>
-            </w:r>
-            <w:proofErr w:type="gramStart"/>
-            <w:r>
-              <w:t>So</w:t>
-            </w:r>
-            <w:proofErr w:type="gramEnd"/>
-            <w:r>
-              <w:t xml:space="preserve"> we place a </w:t>
-            </w:r>
-            <w:proofErr w:type="gramStart"/>
-            <w:r>
-              <w:t>‘ and</w:t>
-            </w:r>
-            <w:proofErr w:type="gramEnd"/>
-            <w:r>
-              <w:t xml:space="preserve"> then OR ‘1’ = ‘1’. For the password section, we can OR with it to remove its effect. Hence, the input vector to disrupt the section will be:</w:t>
+              <w:t xml:space="preserve"> We have two ways to get through: directly or around it. Breaking the validation itself with another password or brute force is slow and annoying, so it is easier to go around it. We can edit the query so the password is ignored and the username is cancelled out by a permanently true statement. So we place a ‘ and then OR ‘1’ = ‘1’. For the password section, we can OR with it to remove its effect. Hence, the input vector to disrupt the section will be:</w:t>
             </w:r>
           </w:p>
           <w:p/>
@@ -1337,7 +1818,6 @@
               <w:rPr>
                 <w:noProof/>
               </w:rPr>
-              <w:lastRenderedPageBreak/>
               <w:drawing>
                 <wp:anchor distT="0" distB="0" distL="114300" distR="114300" simplePos="0" relativeHeight="251662336" behindDoc="0" locked="0" layoutInCell="1" allowOverlap="1" wp14:anchorId="7305063C" wp14:editId="22CD1EAA">
                   <wp:simplePos x="0" y="0"/>
@@ -1362,7 +1842,7 @@
                           <pic:cNvPicPr/>
                         </pic:nvPicPr>
                         <pic:blipFill>
-                          <a:blip r:embed="rId19">
+                          <a:blip r:embed="rId20">
                             <a:extLst>
                               <a:ext uri="{28A0092B-C50C-407E-A947-70E740481C1C}">
                                 <a14:useLocalDpi xmlns:a14="http://schemas.microsoft.com/office/drawing/2010/main" val="0"/>
@@ -1410,7 +1890,7 @@
                           <pic:cNvPicPr/>
                         </pic:nvPicPr>
                         <pic:blipFill>
-                          <a:blip r:embed="rId20"/>
+                          <a:blip r:embed="rId21"/>
                           <a:stretch>
                             <a:fillRect/>
                           </a:stretch>
@@ -1480,7 +1960,7 @@
                           <pic:cNvPicPr/>
                         </pic:nvPicPr>
                         <pic:blipFill>
-                          <a:blip r:embed="rId21"/>
+                          <a:blip r:embed="rId22"/>
                           <a:stretch>
                             <a:fillRect/>
                           </a:stretch>
@@ -1515,29 +1995,9 @@
             <w:r>
               <w:t xml:space="preserve">That made me suspicious that there might be an isolated database containing the flag, based on the naming and exact SQL syntax shown. I used a similar injection method as </w:t>
             </w:r>
-            <w:proofErr w:type="gramStart"/>
-            <w:r>
-              <w:t>above, but</w:t>
-            </w:r>
-            <w:proofErr w:type="gramEnd"/>
-            <w:r>
-              <w:t xml:space="preserve"> had to be careful with the syntax. By using the UNION operator, I could combine the normal retrieved entries with those from the secret table. To keep the SQL valid, I commented </w:t>
-            </w:r>
-            <w:proofErr w:type="gramStart"/>
-            <w:r>
-              <w:t>out</w:t>
-            </w:r>
-            <w:proofErr w:type="gramEnd"/>
-            <w:r>
-              <w:t xml:space="preserve"> the password section with - -. This gave a valid SQL injection to access the </w:t>
-            </w:r>
-            <w:proofErr w:type="spellStart"/>
-            <w:r>
-              <w:t>my_secret_table</w:t>
-            </w:r>
-            <w:proofErr w:type="spellEnd"/>
-            <w:r>
-              <w:t>.</w:t>
+            <w:r>
+              <w:lastRenderedPageBreak/>
+              <w:t>above, but had to be careful with the syntax. By using the UNION operator, I could combine the normal retrieved entries with those from the secret table. To keep the SQL valid, I commented out the password section with - -. This gave a valid SQL injection to access the my_secret_table.</w:t>
             </w:r>
           </w:p>
           <w:p>
@@ -1561,7 +2021,7 @@
                           <pic:cNvPicPr/>
                         </pic:nvPicPr>
                         <pic:blipFill rotWithShape="1">
-                          <a:blip r:embed="rId22"/>
+                          <a:blip r:embed="rId23"/>
                           <a:srcRect t="34154" b="22788"/>
                           <a:stretch>
                             <a:fillRect/>
@@ -1594,7 +2054,6 @@
           <w:p/>
           <w:p>
             <w:r>
-              <w:lastRenderedPageBreak/>
               <w:t xml:space="preserve">  </w:t>
             </w:r>
             <w:r>
@@ -1617,7 +2076,7 @@
                           <pic:cNvPicPr/>
                         </pic:nvPicPr>
                         <pic:blipFill>
-                          <a:blip r:embed="rId23"/>
+                          <a:blip r:embed="rId24"/>
                           <a:stretch>
                             <a:fillRect/>
                           </a:stretch>
@@ -1655,55 +2114,7 @@
               </w:rPr>
             </w:pPr>
             <w:r>
-              <w:t xml:space="preserve">From a brief look at the code, it seems the developers tried to use a blacklist to block injected operators from reaching the server. Their assumption is that we will type injected code neatly in lowercase or uppercase. That is the critical flaw, because we can type in </w:t>
-            </w:r>
-            <w:proofErr w:type="spellStart"/>
-            <w:r>
-              <w:t>aLtErNaTiNg</w:t>
-            </w:r>
-            <w:proofErr w:type="spellEnd"/>
-            <w:r>
-              <w:t xml:space="preserve"> </w:t>
-            </w:r>
-            <w:proofErr w:type="spellStart"/>
-            <w:r>
-              <w:t>CaSe</w:t>
-            </w:r>
-            <w:proofErr w:type="spellEnd"/>
-            <w:r>
-              <w:t xml:space="preserve"> and the query will still pass the blacklist and remain valid, since SQL is not case-sensitive. Also, any other missed operator or case combination would get through, which shows why blacklists are weak: it only takes one missed combination to fail. </w:t>
-            </w:r>
-            <w:proofErr w:type="gramStart"/>
-            <w:r>
-              <w:t>So</w:t>
-            </w:r>
-            <w:proofErr w:type="gramEnd"/>
-            <w:r>
-              <w:t xml:space="preserve"> we can do exactly that and introduce a </w:t>
-            </w:r>
-            <w:proofErr w:type="spellStart"/>
-            <w:r>
-              <w:t>UnIOn</w:t>
-            </w:r>
-            <w:proofErr w:type="spellEnd"/>
-            <w:r>
-              <w:t xml:space="preserve"> from the </w:t>
-            </w:r>
-            <w:proofErr w:type="spellStart"/>
-            <w:r>
-              <w:t>top_secret</w:t>
-            </w:r>
-            <w:proofErr w:type="spellEnd"/>
-            <w:r>
-              <w:t xml:space="preserve"> table with a comment to remove the remaining conditions. Hence, the flag was </w:t>
-            </w:r>
-            <w:proofErr w:type="gramStart"/>
-            <w:r>
-              <w:t>able to be captured</w:t>
-            </w:r>
-            <w:proofErr w:type="gramEnd"/>
-            <w:r>
-              <w:t>:</w:t>
+              <w:t>From a brief look at the code, it seems the developers tried to use a blacklist to block injected operators from reaching the server. Their assumption is that we will type injected code neatly in lowercase or uppercase. That is the critical flaw, because we can type in aLtErNaTiNg CaSe and the query will still pass the blacklist and remain valid, since SQL is not case-sensitive. Also, any other missed operator or case combination would get through, which shows why blacklists are weak: it only takes one missed combination to fail. So we can do exactly that and introduce a UnIOn from the top_secret table with a comment to remove the remaining conditions. Hence, the flag was able to be captured:</w:t>
             </w:r>
           </w:p>
           <w:p/>
@@ -1713,6 +2124,7 @@
               <w:rPr>
                 <w:noProof/>
               </w:rPr>
+              <w:lastRenderedPageBreak/>
               <w:drawing>
                 <wp:inline distT="0" distB="0" distL="0" distR="0" wp14:anchorId="0F41DA0E" wp14:editId="6C571796">
                   <wp:extent cx="5943600" cy="1784985"/>
@@ -1729,7 +2141,7 @@
                           <pic:cNvPicPr/>
                         </pic:nvPicPr>
                         <pic:blipFill>
-                          <a:blip r:embed="rId24"/>
+                          <a:blip r:embed="rId25"/>
                           <a:stretch>
                             <a:fillRect/>
                           </a:stretch>
@@ -1773,7 +2185,7 @@
                           <pic:cNvPicPr/>
                         </pic:nvPicPr>
                         <pic:blipFill>
-                          <a:blip r:embed="rId25"/>
+                          <a:blip r:embed="rId26"/>
                           <a:stretch>
                             <a:fillRect/>
                           </a:stretch>
@@ -1799,7 +2211,6 @@
               <w:rPr>
                 <w:noProof/>
               </w:rPr>
-              <w:lastRenderedPageBreak/>
               <w:drawing>
                 <wp:inline distT="0" distB="0" distL="0" distR="0" wp14:anchorId="07753472" wp14:editId="3669A7A5">
                   <wp:extent cx="4261496" cy="2556442"/>
@@ -1816,7 +2227,7 @@
                           <pic:cNvPicPr/>
                         </pic:nvPicPr>
                         <pic:blipFill>
-                          <a:blip r:embed="rId26"/>
+                          <a:blip r:embed="rId27"/>
                           <a:stretch>
                             <a:fillRect/>
                           </a:stretch>
@@ -1863,7 +2274,7 @@
       <w:pPr>
         <w:pStyle w:val="Heading2"/>
       </w:pPr>
-      <w:hyperlink r:id="rId27">
+      <w:hyperlink r:id="rId28">
         <w:r>
           <w:rPr>
             <w:rStyle w:val="Hyperlink"/>
@@ -1891,44 +2302,10 @@
           </w:tcPr>
           <w:p>
             <w:r>
-              <w:t xml:space="preserve">During the tutorial </w:t>
-            </w:r>
-            <w:proofErr w:type="spellStart"/>
-            <w:proofErr w:type="gramStart"/>
-            <w:r>
-              <w:t>their</w:t>
-            </w:r>
-            <w:proofErr w:type="spellEnd"/>
-            <w:proofErr w:type="gramEnd"/>
-            <w:r>
-              <w:t xml:space="preserve"> was a significant delay </w:t>
-            </w:r>
-            <w:proofErr w:type="gramStart"/>
-            <w:r>
-              <w:t>due</w:t>
-            </w:r>
-            <w:proofErr w:type="gramEnd"/>
-            <w:r>
-              <w:t xml:space="preserve"> a tutor not arriving until midway through.</w:t>
-            </w:r>
-            <w:r>
-              <w:t xml:space="preserve"> </w:t>
-            </w:r>
-            <w:proofErr w:type="gramStart"/>
-            <w:r>
-              <w:t>However</w:t>
-            </w:r>
-            <w:proofErr w:type="gramEnd"/>
-            <w:r>
-              <w:t xml:space="preserve"> we were able to cover up the initial rumble scenario and the subsequent case where we </w:t>
-            </w:r>
-            <w:proofErr w:type="gramStart"/>
-            <w:r>
-              <w:t>find</w:t>
-            </w:r>
-            <w:proofErr w:type="gramEnd"/>
-            <w:r>
-              <w:t xml:space="preserve"> out that there is false reporting</w:t>
+              <w:t>During the tutorial their was a significant delay due a tutor not arriving until midway through.</w:t>
+            </w:r>
+            <w:r>
+              <w:t xml:space="preserve"> However we were able to cover up the initial rumble scenario and the subsequent case where we find out that there is false reporting</w:t>
             </w:r>
             <w:r>
               <w:t>.</w:t>
@@ -1966,6 +2343,7 @@
               </w:rPr>
             </w:pPr>
             <w:r>
+              <w:lastRenderedPageBreak/>
               <w:t>People immediately assumed to trust their peers in determining an earthquake</w:t>
             </w:r>
           </w:p>
@@ -1983,15 +2361,7 @@
               </w:rPr>
             </w:pPr>
             <w:r>
-              <w:t xml:space="preserve">The lack of strong evidence to suggest an earthquake was a brief observation and the </w:t>
-            </w:r>
-            <w:proofErr w:type="spellStart"/>
-            <w:r>
-              <w:t>opions</w:t>
-            </w:r>
-            <w:proofErr w:type="spellEnd"/>
-            <w:r>
-              <w:t xml:space="preserve"> of other people, using this for pure judgement felt flawed because often in the context of cyber security and crisis, human judgement is the weakest link.</w:t>
+              <w:t>The lack of strong evidence to suggest an earthquake was a brief observation and the opions of other people, using this for pure judgement felt flawed because often in the context of cyber security and crisis, human judgement is the weakest link.</w:t>
             </w:r>
           </w:p>
           <w:p>
@@ -2003,31 +2373,7 @@
               </w:numPr>
             </w:pPr>
             <w:r>
-              <w:t xml:space="preserve">Interesting to see the response of fellow </w:t>
-            </w:r>
-            <w:proofErr w:type="gramStart"/>
-            <w:r>
-              <w:t>class mates</w:t>
-            </w:r>
-            <w:proofErr w:type="gramEnd"/>
-            <w:r>
-              <w:t xml:space="preserve"> when suggesting that we should </w:t>
-            </w:r>
-            <w:proofErr w:type="gramStart"/>
-            <w:r>
-              <w:t>actually question</w:t>
-            </w:r>
-            <w:proofErr w:type="gramEnd"/>
-            <w:r>
-              <w:t xml:space="preserve"> our assumption of an earthquake. This first made me more aware of the social engineering mechanism that relies on our default </w:t>
-            </w:r>
-            <w:proofErr w:type="spellStart"/>
-            <w:r>
-              <w:t>behaviours</w:t>
-            </w:r>
-            <w:proofErr w:type="spellEnd"/>
-            <w:r>
-              <w:t xml:space="preserve"> to lead ourselves into errors or traps.</w:t>
+              <w:t>Interesting to see the response of fellow class mates when suggesting that we should actually question our assumption of an earthquake. This first made me more aware of the social engineering mechanism that relies on our default behaviours to lead ourselves into errors or traps.</w:t>
             </w:r>
           </w:p>
           <w:p>
@@ -2080,7 +2426,7 @@
       <w:pPr>
         <w:pStyle w:val="Heading2"/>
       </w:pPr>
-      <w:hyperlink r:id="rId28">
+      <w:hyperlink r:id="rId29">
         <w:r>
           <w:rPr>
             <w:rStyle w:val="Hyperlink"/>
@@ -2137,6 +2483,7 @@
           <w:b/>
           <w:bCs/>
         </w:rPr>
+        <w:lastRenderedPageBreak/>
         <w:t>Wrap up</w:t>
       </w:r>
     </w:p>
@@ -2150,23 +2497,18 @@
     </w:p>
     <w:p>
       <w:r>
-        <w:t xml:space="preserve">To submit a valid portfolio entry, complete the activities, save your work as a PDF, and upload it to the </w:t>
-      </w:r>
-      <w:proofErr w:type="gramStart"/>
-      <w:r>
-        <w:t xml:space="preserve">relevant </w:t>
+        <w:t xml:space="preserve">To submit a valid portfolio entry, complete the activities, save your work as a PDF, and upload it to the relevant </w:t>
       </w:r>
       <w:r>
         <w:t>week</w:t>
       </w:r>
-      <w:proofErr w:type="gramEnd"/>
       <w:r>
         <w:t xml:space="preserve"> submission page on Moodle.</w:t>
       </w:r>
     </w:p>
     <w:sectPr>
-      <w:headerReference w:type="default" r:id="rId29"/>
-      <w:footerReference w:type="default" r:id="rId30"/>
+      <w:headerReference w:type="default" r:id="rId30"/>
+      <w:footerReference w:type="default" r:id="rId31"/>
       <w:pgSz w:w="12240" w:h="15840"/>
       <w:pgMar w:top="1440" w:right="1440" w:bottom="1440" w:left="1440" w:header="720" w:footer="720" w:gutter="0"/>
       <w:cols w:space="720"/>
@@ -5209,6 +5551,7 @@
   <w:style w:type="character" w:default="1" w:styleId="DefaultParagraphFont">
     <w:name w:val="Default Paragraph Font"/>
     <w:uiPriority w:val="1"/>
+    <w:semiHidden/>
     <w:unhideWhenUsed/>
   </w:style>
   <w:style w:type="table" w:default="1" w:styleId="TableNormal">
@@ -5371,6 +5714,16 @@
     <w:rPr>
       <w:color w:val="605E5C"/>
       <w:shd w:val="clear" w:color="auto" w:fill="E1DFDD"/>
+    </w:rPr>
+  </w:style>
+  <w:style w:type="character" w:styleId="PlaceholderText">
+    <w:name w:val="Placeholder Text"/>
+    <w:basedOn w:val="DefaultParagraphFont"/>
+    <w:uiPriority w:val="99"/>
+    <w:semiHidden/>
+    <w:rsid w:val="003E059B"/>
+    <w:rPr>
+      <w:color w:val="666666"/>
     </w:rPr>
   </w:style>
 </w:styles>

</xml_diff>